<commit_message>
Documenten aangepast met enquete erbij
Enquete resultaten zitten er nu in.
</commit_message>
<xml_diff>
--- a/UX/Research/Design_Challenge_AI-coach_StudieStap.docx
+++ b/UX/Research/Design_Challenge_AI-coach_StudieStap.docx
@@ -491,7 +491,7 @@
           <w:sz w:val="22"/>
           <w:szCs w:val="22"/>
         </w:rPr>
-        <w:t>StudieStap geeft workshops op middelbare scholen om leerlingen te helpen bij hun studiekeuze. Deze workshops worden gegeven door StudieStappers, een groep van ongeveer veertig mensen met heel uiteenlopende achtergronden, van psychologie tot data-analyse tot werktuigbouwkunde. Er is op dit moment geen vaste manier om te zien hoe een workshop is verlopen, omdat er niet bij elke workshop iemand kan meekijken. Daarom wordt er een AI-coach ontwikkeld die audio van een workshop analyseert en de StudieStapper daarna feedback geeft.</w:t>
+        <w:t>StudieStap geeft workshops op middelbare scholen om leerlingen te helpen bij hun studiekeuze. Deze workshops worden gegeven door StudieStappers, een groep van ongeveer twintig mensen met heel uiteenlopende achtergronden, van psychologie tot data-analyse tot werktuigbouwkunde. Er is op dit moment geen vaste manier om te zien hoe een workshop is verlopen, omdat er niet bij elke workshop iemand kan meekijken. Daarom wordt er een AI-coach ontwikkeld die audio van een workshop analyseert en de StudieStapper daarna feedback geeft.</w:t>
       </w:r>
     </w:p>
     <w:p>
@@ -768,7 +768,140 @@
           <w:sz w:val="22"/>
           <w:szCs w:val="22"/>
         </w:rPr>
-        <w:t>De enquête onder StudieStappers zelf moet nog worden afgenomen. De inzichten hierboven komen dus uit het vooronderzoek en het literatuuronderzoek, en het ontwerp wordt later getest en bijgesteld met StudieStappers.</w:t>
+        <w:t xml:space="preserve">Om te checken of deze inzichten ook voor StudieStappers zelf gelden, heb ik een enquête uitgezet die door 11 StudieStappers is ingevuld. Die bevestigt de design challenge grotendeels, met één belangrijke nuance. StudieStappers willen vooral een uitgebreide toelichting: negen van de elf kozen daarvoor, en maar één voor alleen korte cijfers of een grafiek (afbeelding 1). ‘In een paar minuten een helder overzicht’ blijft het startpunt, maar achter dat overzicht moet een duidelijke uitleg in gewone taal zitten.</w:t>
+      </w:r>
+    </w:p>
+    <w:p>
+      <w:pPr>
+        <w:keepNext/>
+        <w:spacing w:after="80" w:line="240" w:lineRule="auto"/>
+        <w:ind w:firstLine="0" w:left="0"/>
+        <w:jc w:val="center"/>
+      </w:pPr>
+      <w:r>
+        <w:drawing>
+          <wp:inline xmlns:a="http://schemas.openxmlformats.org/drawingml/2006/main" xmlns:pic="http://schemas.openxmlformats.org/drawingml/2006/picture">
+            <wp:extent cx="4680000" cy="2241057"/>
+            <wp:docPr id="1" name="Picture 1"/>
+            <wp:cNvGraphicFramePr>
+              <a:graphicFrameLocks noChangeAspect="1"/>
+            </wp:cNvGraphicFramePr>
+            <a:graphic>
+              <a:graphicData uri="http://schemas.openxmlformats.org/drawingml/2006/picture">
+                <pic:pic>
+                  <pic:nvPicPr>
+                    <pic:cNvPr id="0" name="caee1ab4-image.png"/>
+                    <pic:cNvPicPr/>
+                  </pic:nvPicPr>
+                  <pic:blipFill>
+                    <a:blip r:embed="rId11"/>
+                    <a:stretch>
+                      <a:fillRect/>
+                    </a:stretch>
+                  </pic:blipFill>
+                  <pic:spPr>
+                    <a:xfrm>
+                      <a:off x="0" y="0"/>
+                      <a:ext cx="4680000" cy="2241057"/>
+                    </a:xfrm>
+                    <a:prstGeom prst="rect"/>
+                  </pic:spPr>
+                </pic:pic>
+              </a:graphicData>
+            </a:graphic>
+          </wp:inline>
+        </w:drawing>
+      </w:r>
+    </w:p>
+    <w:p>
+      <w:pPr>
+        <w:keepNext w:val="0"/>
+        <w:spacing w:after="160"/>
+        <w:ind w:firstLine="0"/>
+      </w:pPr>
+      <w:r>
+        <w:rPr>
+          <w:rFonts w:ascii="Calibri" w:eastAsia="Calibri" w:hAnsi="Calibri" w:cs="Calibri"/>
+          <w:i/>
+          <w:iCs/>
+          <w:color w:val="595959"/>
+          <w:sz w:val="18"/>
+          <w:szCs w:val="18"/>
+        </w:rPr>
+        <w:t xml:space="preserve">Afbeelding 1: Diagram over welke vorm van feedback de respondenten het meest aanspreekt</w:t>
+      </w:r>
+    </w:p>
+    <w:p>
+      <w:pPr>
+        <w:spacing w:after="160"/>
+      </w:pPr>
+      <w:r>
+        <w:rPr>
+          <w:rFonts w:ascii="Calibri" w:eastAsia="Calibri" w:hAnsi="Calibri" w:cs="Calibri"/>
+          <w:sz w:val="22"/>
+          <w:szCs w:val="22"/>
+        </w:rPr>
+        <w:t xml:space="preserve">Voor ‘aanvoelt als een coach’ geeft de enquête steun. Negen van de elf vinden ‘warm &amp; persoonlijk’ het best passen bij StudieStap en acht ‘speels &amp; kleurrijk’. Niemand koos ‘strak &amp; zakelijk’ (afbeelding 2). Wel is het vertrouwen in AI-feedback laag en willen StudieStappers zelf bepalen wat er met hun opname gebeurt. Dat maakt het uitgangspunt ‘zichtbaar waar het vandaan komt’ extra belangrijk. Het ontwerp wordt later getest en bijgesteld met StudieStappers.</w:t>
+      </w:r>
+    </w:p>
+    <w:p>
+      <w:pPr>
+        <w:keepNext/>
+        <w:spacing w:after="80" w:line="240" w:lineRule="auto"/>
+        <w:ind w:firstLine="0" w:left="0"/>
+        <w:jc w:val="center"/>
+      </w:pPr>
+      <w:r>
+        <w:drawing>
+          <wp:inline xmlns:a="http://schemas.openxmlformats.org/drawingml/2006/main" xmlns:pic="http://schemas.openxmlformats.org/drawingml/2006/picture">
+            <wp:extent cx="4680000" cy="2134910"/>
+            <wp:docPr id="2" name="Picture 2"/>
+            <wp:cNvGraphicFramePr>
+              <a:graphicFrameLocks noChangeAspect="1"/>
+            </wp:cNvGraphicFramePr>
+            <a:graphic>
+              <a:graphicData uri="http://schemas.openxmlformats.org/drawingml/2006/picture">
+                <pic:pic>
+                  <pic:nvPicPr>
+                    <pic:cNvPr id="0" name="118f5772-image.png"/>
+                    <pic:cNvPicPr/>
+                  </pic:nvPicPr>
+                  <pic:blipFill>
+                    <a:blip r:embed="rId12"/>
+                    <a:stretch>
+                      <a:fillRect/>
+                    </a:stretch>
+                  </pic:blipFill>
+                  <pic:spPr>
+                    <a:xfrm>
+                      <a:off x="0" y="0"/>
+                      <a:ext cx="4680000" cy="2134910"/>
+                    </a:xfrm>
+                    <a:prstGeom prst="rect"/>
+                  </pic:spPr>
+                </pic:pic>
+              </a:graphicData>
+            </a:graphic>
+          </wp:inline>
+        </w:drawing>
+      </w:r>
+    </w:p>
+    <w:p>
+      <w:pPr>
+        <w:keepNext w:val="0"/>
+        <w:spacing w:after="160"/>
+        <w:ind w:firstLine="0"/>
+      </w:pPr>
+      <w:r>
+        <w:rPr>
+          <w:rFonts w:ascii="Calibri" w:eastAsia="Calibri" w:hAnsi="Calibri" w:cs="Calibri"/>
+          <w:i/>
+          <w:iCs/>
+          <w:color w:val="595959"/>
+          <w:sz w:val="18"/>
+          <w:szCs w:val="18"/>
+        </w:rPr>
+        <w:t xml:space="preserve">Afbeelding 2: Diagram over welke stijl volgens de respondenten het best past bij StudieStap</w:t>
       </w:r>
     </w:p>
     <w:p>

</xml_diff>